<commit_message>
Build log: full system diagram, clickable content-file links, clearer prompts section
Co-Authored-By: Claude Opus 5 <noreply@anthropic.com>
Claude-Session: https://claude.ai/code/session_01UkYraoXMEPqUCAeqnCcg3Y
</commit_message>
<xml_diff>
--- a/note/ai-build-log.docx
+++ b/note/ai-build-log.docx
@@ -46,8 +46,22 @@
           <w:sz w:val="15"/>
           <w:szCs w:val="15"/>
         </w:rPr>
-        <w:t xml:space="preserve">Ujjwal Goel  ·  55 commits, 5–13 October 2026  ·  ~5,000 lines of application code, 8,400 lines of rules and content, 37 tests</w:t>
-      </w:r>
+        <w:t xml:space="preserve">Ujjwal Goel  ·  55 commits, 5–13 October 2026  ·  ~5,000 lines of application code, 8,400 lines of rules and content, 37 tests  ·  </w:t>
+      </w:r>
+      <w:hyperlink w:history="1" r:id="rId_lutctjqrebuw5vi3fzhj">
+        <w:r>
+          <w:rPr>
+            <w:rFonts w:ascii="Calibri" w:cs="Calibri" w:eastAsia="Calibri" w:hAnsi="Calibri"/>
+            <w:b/>
+            <w:bCs/>
+            <w:color w:val="1A4FD6"/>
+            <w:sz w:val="15"/>
+            <w:szCs w:val="15"/>
+            <w:u w:val="single"/>
+          </w:rPr>
+          <w:t xml:space="preserve">repository</w:t>
+        </w:r>
+      </w:hyperlink>
     </w:p>
     <w:p>
       <w:pPr>
@@ -795,7 +809,594 @@
           <w:sz w:val="17"/>
           <w:szCs w:val="17"/>
         </w:rPr>
-        <w:t xml:space="preserve">The agent's behaviour does not live in code. It lives in content files that are read fresh on every call — </w:t>
+        <w:t xml:space="preserve">The agent is three things: a set of written instructions, two prompts that return JSON, and a rule engine the model is not allowed to overrule. The first part is all in the repository and can be read directly — these are the files that decide what the agent says and when it hands a borrower over.</w:t>
+      </w:r>
+    </w:p>
+    <w:tbl>
+      <w:tblPr>
+        <w:tblW w:type="dxa" w:w="9240"/>
+        <w:tblBorders>
+          <w:top w:val="single" w:color="auto" w:sz="4"/>
+          <w:left w:val="single" w:color="auto" w:sz="4"/>
+          <w:bottom w:val="single" w:color="auto" w:sz="4"/>
+          <w:right w:val="single" w:color="auto" w:sz="4"/>
+          <w:insideH w:val="single" w:color="auto" w:sz="4"/>
+          <w:insideV w:val="single" w:color="auto" w:sz="4"/>
+        </w:tblBorders>
+      </w:tblPr>
+      <w:tblGrid>
+        <w:gridCol w:w="3400"/>
+        <w:gridCol w:w="5840"/>
+      </w:tblGrid>
+      <w:tr>
+        <w:trPr>
+          <w:tblHeader/>
+        </w:trPr>
+        <w:tc>
+          <w:tcPr>
+            <w:tcW w:type="dxa" w:w="3400"/>
+            <w:tcBorders>
+              <w:top w:val="single" w:color="C9D2E0" w:sz="2"/>
+              <w:left w:val="none" w:color="FFFFFF" w:sz="0"/>
+              <w:bottom w:val="single" w:color="C9D2E0" w:sz="2"/>
+              <w:right w:val="none" w:color="FFFFFF" w:sz="0"/>
+            </w:tcBorders>
+            <w:shd w:fill="EEF3FB" w:color="auto" w:val="clear"/>
+            <w:tcMar>
+              <w:top w:type="dxa" w:w="40"/>
+              <w:left w:type="dxa" w:w="85"/>
+              <w:bottom w:type="dxa" w:w="40"/>
+              <w:right w:type="dxa" w:w="85"/>
+            </w:tcMar>
+          </w:tcPr>
+          <w:p>
+            <w:pPr>
+              <w:spacing w:after="0" w:line="205"/>
+            </w:pPr>
+            <w:r>
+              <w:rPr>
+                <w:rFonts w:ascii="Calibri" w:cs="Calibri" w:eastAsia="Calibri" w:hAnsi="Calibri"/>
+                <w:b/>
+                <w:bCs/>
+                <w:color w:val="11243A"/>
+                <w:sz w:val="15"/>
+                <w:szCs w:val="15"/>
+              </w:rPr>
+              <w:t xml:space="preserve">File (click to open on GitHub)</w:t>
+            </w:r>
+          </w:p>
+        </w:tc>
+        <w:tc>
+          <w:tcPr>
+            <w:tcW w:type="dxa" w:w="5840"/>
+            <w:tcBorders>
+              <w:top w:val="single" w:color="C9D2E0" w:sz="2"/>
+              <w:left w:val="none" w:color="FFFFFF" w:sz="0"/>
+              <w:bottom w:val="single" w:color="C9D2E0" w:sz="2"/>
+              <w:right w:val="none" w:color="FFFFFF" w:sz="0"/>
+            </w:tcBorders>
+            <w:shd w:fill="EEF3FB" w:color="auto" w:val="clear"/>
+            <w:tcMar>
+              <w:top w:type="dxa" w:w="40"/>
+              <w:left w:type="dxa" w:w="85"/>
+              <w:bottom w:type="dxa" w:w="40"/>
+              <w:right w:type="dxa" w:w="85"/>
+            </w:tcMar>
+          </w:tcPr>
+          <w:p>
+            <w:pPr>
+              <w:spacing w:after="0" w:line="205"/>
+            </w:pPr>
+            <w:r>
+              <w:rPr>
+                <w:rFonts w:ascii="Calibri" w:cs="Calibri" w:eastAsia="Calibri" w:hAnsi="Calibri"/>
+                <w:b/>
+                <w:bCs/>
+                <w:color w:val="11243A"/>
+                <w:sz w:val="15"/>
+                <w:szCs w:val="15"/>
+              </w:rPr>
+              <w:t xml:space="preserve">What it governs</w:t>
+            </w:r>
+          </w:p>
+        </w:tc>
+      </w:tr>
+      <w:tr>
+        <w:tc>
+          <w:tcPr>
+            <w:tcW w:type="dxa" w:w="3400"/>
+            <w:tcBorders>
+              <w:top w:val="single" w:color="C9D2E0" w:sz="2"/>
+              <w:left w:val="none" w:color="FFFFFF" w:sz="0"/>
+              <w:bottom w:val="single" w:color="C9D2E0" w:sz="2"/>
+              <w:right w:val="none" w:color="FFFFFF" w:sz="0"/>
+            </w:tcBorders>
+            <w:tcMar>
+              <w:top w:type="dxa" w:w="40"/>
+              <w:left w:type="dxa" w:w="85"/>
+              <w:bottom w:type="dxa" w:w="40"/>
+              <w:right w:type="dxa" w:w="85"/>
+            </w:tcMar>
+          </w:tcPr>
+          <w:p>
+            <w:pPr>
+              <w:spacing w:after="0" w:line="205"/>
+            </w:pPr>
+            <w:hyperlink w:history="1" r:id="rIdcvwp9gk5oi70ehpyd8xhf">
+              <w:r>
+                <w:rPr>
+                  <w:rFonts w:ascii="Calibri" w:cs="Calibri" w:eastAsia="Calibri" w:hAnsi="Calibri"/>
+                  <w:b/>
+                  <w:bCs/>
+                  <w:color w:val="1A4FD6"/>
+                  <w:sz w:val="15"/>
+                  <w:szCs w:val="15"/>
+                  <w:u w:val="single"/>
+                </w:rPr>
+                <w:t xml:space="preserve">content/prompts/agent.md</w:t>
+              </w:r>
+            </w:hyperlink>
+          </w:p>
+        </w:tc>
+        <w:tc>
+          <w:tcPr>
+            <w:tcW w:type="dxa" w:w="5840"/>
+            <w:tcBorders>
+              <w:top w:val="single" w:color="C9D2E0" w:sz="2"/>
+              <w:left w:val="none" w:color="FFFFFF" w:sz="0"/>
+              <w:bottom w:val="single" w:color="C9D2E0" w:sz="2"/>
+              <w:right w:val="none" w:color="FFFFFF" w:sz="0"/>
+            </w:tcBorders>
+            <w:tcMar>
+              <w:top w:type="dxa" w:w="40"/>
+              <w:left w:type="dxa" w:w="85"/>
+              <w:bottom w:type="dxa" w:w="40"/>
+              <w:right w:type="dxa" w:w="85"/>
+            </w:tcMar>
+          </w:tcPr>
+          <w:p>
+            <w:pPr>
+              <w:spacing w:after="0" w:line="205"/>
+            </w:pPr>
+            <w:r>
+              <w:rPr>
+                <w:rFonts w:ascii="Calibri" w:cs="Calibri" w:eastAsia="Calibri" w:hAnsi="Calibri"/>
+                <w:color w:val="5B6B85"/>
+                <w:sz w:val="15"/>
+                <w:szCs w:val="15"/>
+              </w:rPr>
+              <w:t xml:space="preserve">How Meera speaks: her role, her limits, and the JSON she must return</w:t>
+            </w:r>
+          </w:p>
+        </w:tc>
+      </w:tr>
+      <w:tr>
+        <w:tc>
+          <w:tcPr>
+            <w:tcW w:type="dxa" w:w="3400"/>
+            <w:tcBorders>
+              <w:top w:val="single" w:color="C9D2E0" w:sz="2"/>
+              <w:left w:val="none" w:color="FFFFFF" w:sz="0"/>
+              <w:bottom w:val="single" w:color="C9D2E0" w:sz="2"/>
+              <w:right w:val="none" w:color="FFFFFF" w:sz="0"/>
+            </w:tcBorders>
+            <w:tcMar>
+              <w:top w:type="dxa" w:w="40"/>
+              <w:left w:type="dxa" w:w="85"/>
+              <w:bottom w:type="dxa" w:w="40"/>
+              <w:right w:type="dxa" w:w="85"/>
+            </w:tcMar>
+          </w:tcPr>
+          <w:p>
+            <w:pPr>
+              <w:spacing w:after="0" w:line="205"/>
+            </w:pPr>
+            <w:hyperlink w:history="1" r:id="rIdn3zchk5erekpsubinwfzi">
+              <w:r>
+                <w:rPr>
+                  <w:rFonts w:ascii="Calibri" w:cs="Calibri" w:eastAsia="Calibri" w:hAnsi="Calibri"/>
+                  <w:b/>
+                  <w:bCs/>
+                  <w:color w:val="1A4FD6"/>
+                  <w:sz w:val="15"/>
+                  <w:szCs w:val="15"/>
+                  <w:u w:val="single"/>
+                </w:rPr>
+                <w:t xml:space="preserve">content/script.md</w:t>
+              </w:r>
+            </w:hyperlink>
+          </w:p>
+        </w:tc>
+        <w:tc>
+          <w:tcPr>
+            <w:tcW w:type="dxa" w:w="5840"/>
+            <w:tcBorders>
+              <w:top w:val="single" w:color="C9D2E0" w:sz="2"/>
+              <w:left w:val="none" w:color="FFFFFF" w:sz="0"/>
+              <w:bottom w:val="single" w:color="C9D2E0" w:sz="2"/>
+              <w:right w:val="none" w:color="FFFFFF" w:sz="0"/>
+            </w:tcBorders>
+            <w:tcMar>
+              <w:top w:type="dxa" w:w="40"/>
+              <w:left w:type="dxa" w:w="85"/>
+              <w:bottom w:type="dxa" w:w="40"/>
+              <w:right w:type="dxa" w:w="85"/>
+            </w:tcMar>
+          </w:tcPr>
+          <w:p>
+            <w:pPr>
+              <w:spacing w:after="0" w:line="205"/>
+            </w:pPr>
+            <w:r>
+              <w:rPr>
+                <w:rFonts w:ascii="Calibri" w:cs="Calibri" w:eastAsia="Calibri" w:hAnsi="Calibri"/>
+                <w:color w:val="5B6B85"/>
+                <w:sz w:val="15"/>
+                <w:szCs w:val="15"/>
+              </w:rPr>
+              <w:t xml:space="preserve">The call itself: opening, identity check, how to ask for a promise, how to close</w:t>
+            </w:r>
+          </w:p>
+        </w:tc>
+      </w:tr>
+      <w:tr>
+        <w:tc>
+          <w:tcPr>
+            <w:tcW w:type="dxa" w:w="3400"/>
+            <w:tcBorders>
+              <w:top w:val="single" w:color="C9D2E0" w:sz="2"/>
+              <w:left w:val="none" w:color="FFFFFF" w:sz="0"/>
+              <w:bottom w:val="single" w:color="C9D2E0" w:sz="2"/>
+              <w:right w:val="none" w:color="FFFFFF" w:sz="0"/>
+            </w:tcBorders>
+            <w:tcMar>
+              <w:top w:type="dxa" w:w="40"/>
+              <w:left w:type="dxa" w:w="85"/>
+              <w:bottom w:type="dxa" w:w="40"/>
+              <w:right w:type="dxa" w:w="85"/>
+            </w:tcMar>
+          </w:tcPr>
+          <w:p>
+            <w:pPr>
+              <w:spacing w:after="0" w:line="205"/>
+            </w:pPr>
+            <w:hyperlink w:history="1" r:id="rIdqopbsw8jshyjlm_74qh0v">
+              <w:r>
+                <w:rPr>
+                  <w:rFonts w:ascii="Calibri" w:cs="Calibri" w:eastAsia="Calibri" w:hAnsi="Calibri"/>
+                  <w:b/>
+                  <w:bCs/>
+                  <w:color w:val="1A4FD6"/>
+                  <w:sz w:val="15"/>
+                  <w:szCs w:val="15"/>
+                  <w:u w:val="single"/>
+                </w:rPr>
+                <w:t xml:space="preserve">content/policy.json</w:t>
+              </w:r>
+            </w:hyperlink>
+          </w:p>
+        </w:tc>
+        <w:tc>
+          <w:tcPr>
+            <w:tcW w:type="dxa" w:w="5840"/>
+            <w:tcBorders>
+              <w:top w:val="single" w:color="C9D2E0" w:sz="2"/>
+              <w:left w:val="none" w:color="FFFFFF" w:sz="0"/>
+              <w:bottom w:val="single" w:color="C9D2E0" w:sz="2"/>
+              <w:right w:val="none" w:color="FFFFFF" w:sz="0"/>
+            </w:tcBorders>
+            <w:tcMar>
+              <w:top w:type="dxa" w:w="40"/>
+              <w:left w:type="dxa" w:w="85"/>
+              <w:bottom w:type="dxa" w:w="40"/>
+              <w:right w:type="dxa" w:w="85"/>
+            </w:tcMar>
+          </w:tcPr>
+          <w:p>
+            <w:pPr>
+              <w:spacing w:after="0" w:line="205"/>
+            </w:pPr>
+            <w:r>
+              <w:rPr>
+                <w:rFonts w:ascii="Calibri" w:cs="Calibri" w:eastAsia="Calibri" w:hAnsi="Calibri"/>
+                <w:color w:val="5B6B85"/>
+                <w:sz w:val="15"/>
+                <w:szCs w:val="15"/>
+              </w:rPr>
+              <w:t xml:space="preserve">What she may offer: minimum part payment, link rules, calling hours</w:t>
+            </w:r>
+          </w:p>
+        </w:tc>
+      </w:tr>
+      <w:tr>
+        <w:tc>
+          <w:tcPr>
+            <w:tcW w:type="dxa" w:w="3400"/>
+            <w:tcBorders>
+              <w:top w:val="single" w:color="C9D2E0" w:sz="2"/>
+              <w:left w:val="none" w:color="FFFFFF" w:sz="0"/>
+              <w:bottom w:val="single" w:color="C9D2E0" w:sz="2"/>
+              <w:right w:val="none" w:color="FFFFFF" w:sz="0"/>
+            </w:tcBorders>
+            <w:tcMar>
+              <w:top w:type="dxa" w:w="40"/>
+              <w:left w:type="dxa" w:w="85"/>
+              <w:bottom w:type="dxa" w:w="40"/>
+              <w:right w:type="dxa" w:w="85"/>
+            </w:tcMar>
+          </w:tcPr>
+          <w:p>
+            <w:pPr>
+              <w:spacing w:after="0" w:line="205"/>
+            </w:pPr>
+            <w:hyperlink w:history="1" r:id="rIdvqihiggk3lsgr1rsdshyh">
+              <w:r>
+                <w:rPr>
+                  <w:rFonts w:ascii="Calibri" w:cs="Calibri" w:eastAsia="Calibri" w:hAnsi="Calibri"/>
+                  <w:b/>
+                  <w:bCs/>
+                  <w:color w:val="1A4FD6"/>
+                  <w:sz w:val="15"/>
+                  <w:szCs w:val="15"/>
+                  <w:u w:val="single"/>
+                </w:rPr>
+                <w:t xml:space="preserve">content/guardrails.json</w:t>
+              </w:r>
+            </w:hyperlink>
+          </w:p>
+        </w:tc>
+        <w:tc>
+          <w:tcPr>
+            <w:tcW w:type="dxa" w:w="5840"/>
+            <w:tcBorders>
+              <w:top w:val="single" w:color="C9D2E0" w:sz="2"/>
+              <w:left w:val="none" w:color="FFFFFF" w:sz="0"/>
+              <w:bottom w:val="single" w:color="C9D2E0" w:sz="2"/>
+              <w:right w:val="none" w:color="FFFFFF" w:sz="0"/>
+            </w:tcBorders>
+            <w:tcMar>
+              <w:top w:type="dxa" w:w="40"/>
+              <w:left w:type="dxa" w:w="85"/>
+              <w:bottom w:type="dxa" w:w="40"/>
+              <w:right w:type="dxa" w:w="85"/>
+            </w:tcMar>
+          </w:tcPr>
+          <w:p>
+            <w:pPr>
+              <w:spacing w:after="0" w:line="205"/>
+            </w:pPr>
+            <w:r>
+              <w:rPr>
+                <w:rFonts w:ascii="Calibri" w:cs="Calibri" w:eastAsia="Calibri" w:hAnsi="Calibri"/>
+                <w:color w:val="5B6B85"/>
+                <w:sz w:val="15"/>
+                <w:szCs w:val="15"/>
+              </w:rPr>
+              <w:t xml:space="preserve">The never-do rules: no false promise, no threat, lender facts only</w:t>
+            </w:r>
+          </w:p>
+        </w:tc>
+      </w:tr>
+      <w:tr>
+        <w:tc>
+          <w:tcPr>
+            <w:tcW w:type="dxa" w:w="3400"/>
+            <w:tcBorders>
+              <w:top w:val="single" w:color="C9D2E0" w:sz="2"/>
+              <w:left w:val="none" w:color="FFFFFF" w:sz="0"/>
+              <w:bottom w:val="single" w:color="C9D2E0" w:sz="2"/>
+              <w:right w:val="none" w:color="FFFFFF" w:sz="0"/>
+            </w:tcBorders>
+            <w:tcMar>
+              <w:top w:type="dxa" w:w="40"/>
+              <w:left w:type="dxa" w:w="85"/>
+              <w:bottom w:type="dxa" w:w="40"/>
+              <w:right w:type="dxa" w:w="85"/>
+            </w:tcMar>
+          </w:tcPr>
+          <w:p>
+            <w:pPr>
+              <w:spacing w:after="0" w:line="205"/>
+            </w:pPr>
+            <w:hyperlink w:history="1" r:id="rId2lxy4olar5ccslad_htjh">
+              <w:r>
+                <w:rPr>
+                  <w:rFonts w:ascii="Calibri" w:cs="Calibri" w:eastAsia="Calibri" w:hAnsi="Calibri"/>
+                  <w:b/>
+                  <w:bCs/>
+                  <w:color w:val="1A4FD6"/>
+                  <w:sz w:val="15"/>
+                  <w:szCs w:val="15"/>
+                  <w:u w:val="single"/>
+                </w:rPr>
+                <w:t xml:space="preserve">content/review-checks.json</w:t>
+              </w:r>
+            </w:hyperlink>
+          </w:p>
+        </w:tc>
+        <w:tc>
+          <w:tcPr>
+            <w:tcW w:type="dxa" w:w="5840"/>
+            <w:tcBorders>
+              <w:top w:val="single" w:color="C9D2E0" w:sz="2"/>
+              <w:left w:val="none" w:color="FFFFFF" w:sz="0"/>
+              <w:bottom w:val="single" w:color="C9D2E0" w:sz="2"/>
+              <w:right w:val="none" w:color="FFFFFF" w:sz="0"/>
+            </w:tcBorders>
+            <w:tcMar>
+              <w:top w:type="dxa" w:w="40"/>
+              <w:left w:type="dxa" w:w="85"/>
+              <w:bottom w:type="dxa" w:w="40"/>
+              <w:right w:type="dxa" w:w="85"/>
+            </w:tcMar>
+          </w:tcPr>
+          <w:p>
+            <w:pPr>
+              <w:spacing w:after="0" w:line="205"/>
+            </w:pPr>
+            <w:r>
+              <w:rPr>
+                <w:rFonts w:ascii="Calibri" w:cs="Calibri" w:eastAsia="Calibri" w:hAnsi="Calibri"/>
+                <w:color w:val="5B6B85"/>
+                <w:sz w:val="15"/>
+                <w:szCs w:val="15"/>
+              </w:rPr>
+              <w:t xml:space="preserve">What the reviewer scores after the call, hard rules and judgement rules</w:t>
+            </w:r>
+          </w:p>
+        </w:tc>
+      </w:tr>
+      <w:tr>
+        <w:tc>
+          <w:tcPr>
+            <w:tcW w:type="dxa" w:w="3400"/>
+            <w:tcBorders>
+              <w:top w:val="single" w:color="C9D2E0" w:sz="2"/>
+              <w:left w:val="none" w:color="FFFFFF" w:sz="0"/>
+              <w:bottom w:val="single" w:color="C9D2E0" w:sz="2"/>
+              <w:right w:val="none" w:color="FFFFFF" w:sz="0"/>
+            </w:tcBorders>
+            <w:tcMar>
+              <w:top w:type="dxa" w:w="40"/>
+              <w:left w:type="dxa" w:w="85"/>
+              <w:bottom w:type="dxa" w:w="40"/>
+              <w:right w:type="dxa" w:w="85"/>
+            </w:tcMar>
+          </w:tcPr>
+          <w:p>
+            <w:pPr>
+              <w:spacing w:after="0" w:line="205"/>
+            </w:pPr>
+            <w:hyperlink w:history="1" r:id="rIdw7pmqiakoc1rld2vinghi">
+              <w:r>
+                <w:rPr>
+                  <w:rFonts w:ascii="Calibri" w:cs="Calibri" w:eastAsia="Calibri" w:hAnsi="Calibri"/>
+                  <w:b/>
+                  <w:bCs/>
+                  <w:color w:val="1A4FD6"/>
+                  <w:sz w:val="15"/>
+                  <w:szCs w:val="15"/>
+                  <w:u w:val="single"/>
+                </w:rPr>
+                <w:t xml:space="preserve">content/decision-rules.json</w:t>
+              </w:r>
+            </w:hyperlink>
+          </w:p>
+        </w:tc>
+        <w:tc>
+          <w:tcPr>
+            <w:tcW w:type="dxa" w:w="5840"/>
+            <w:tcBorders>
+              <w:top w:val="single" w:color="C9D2E0" w:sz="2"/>
+              <w:left w:val="none" w:color="FFFFFF" w:sz="0"/>
+              <w:bottom w:val="single" w:color="C9D2E0" w:sz="2"/>
+              <w:right w:val="none" w:color="FFFFFF" w:sz="0"/>
+            </w:tcBorders>
+            <w:tcMar>
+              <w:top w:type="dxa" w:w="40"/>
+              <w:left w:type="dxa" w:w="85"/>
+              <w:bottom w:type="dxa" w:w="40"/>
+              <w:right w:type="dxa" w:w="85"/>
+            </w:tcMar>
+          </w:tcPr>
+          <w:p>
+            <w:pPr>
+              <w:spacing w:after="0" w:line="205"/>
+            </w:pPr>
+            <w:r>
+              <w:rPr>
+                <w:rFonts w:ascii="Calibri" w:cs="Calibri" w:eastAsia="Calibri" w:hAnsi="Calibri"/>
+                <w:color w:val="5B6B85"/>
+                <w:sz w:val="15"/>
+                <w:szCs w:val="15"/>
+              </w:rPr>
+              <w:t xml:space="preserve">The thresholds that route a borrower: bounces, promises kept, cooperation</w:t>
+            </w:r>
+          </w:p>
+        </w:tc>
+      </w:tr>
+      <w:tr>
+        <w:tc>
+          <w:tcPr>
+            <w:tcW w:type="dxa" w:w="3400"/>
+            <w:tcBorders>
+              <w:top w:val="single" w:color="C9D2E0" w:sz="2"/>
+              <w:left w:val="none" w:color="FFFFFF" w:sz="0"/>
+              <w:bottom w:val="single" w:color="C9D2E0" w:sz="2"/>
+              <w:right w:val="none" w:color="FFFFFF" w:sz="0"/>
+            </w:tcBorders>
+            <w:tcMar>
+              <w:top w:type="dxa" w:w="40"/>
+              <w:left w:type="dxa" w:w="85"/>
+              <w:bottom w:type="dxa" w:w="40"/>
+              <w:right w:type="dxa" w:w="85"/>
+            </w:tcMar>
+          </w:tcPr>
+          <w:p>
+            <w:pPr>
+              <w:spacing w:after="0" w:line="205"/>
+            </w:pPr>
+            <w:hyperlink w:history="1" r:id="rIdwax7_md1jtv501w84ibzb">
+              <w:r>
+                <w:rPr>
+                  <w:rFonts w:ascii="Calibri" w:cs="Calibri" w:eastAsia="Calibri" w:hAnsi="Calibri"/>
+                  <w:b/>
+                  <w:bCs/>
+                  <w:color w:val="1A4FD6"/>
+                  <w:sz w:val="15"/>
+                  <w:szCs w:val="15"/>
+                  <w:u w:val="single"/>
+                </w:rPr>
+                <w:t xml:space="preserve">content/customers/history.json</w:t>
+              </w:r>
+            </w:hyperlink>
+          </w:p>
+        </w:tc>
+        <w:tc>
+          <w:tcPr>
+            <w:tcW w:type="dxa" w:w="5840"/>
+            <w:tcBorders>
+              <w:top w:val="single" w:color="C9D2E0" w:sz="2"/>
+              <w:left w:val="none" w:color="FFFFFF" w:sz="0"/>
+              <w:bottom w:val="single" w:color="C9D2E0" w:sz="2"/>
+              <w:right w:val="none" w:color="FFFFFF" w:sz="0"/>
+            </w:tcBorders>
+            <w:tcMar>
+              <w:top w:type="dxa" w:w="40"/>
+              <w:left w:type="dxa" w:w="85"/>
+              <w:bottom w:type="dxa" w:w="40"/>
+              <w:right w:type="dxa" w:w="85"/>
+            </w:tcMar>
+          </w:tcPr>
+          <w:p>
+            <w:pPr>
+              <w:spacing w:after="0" w:line="205"/>
+            </w:pPr>
+            <w:r>
+              <w:rPr>
+                <w:rFonts w:ascii="Calibri" w:cs="Calibri" w:eastAsia="Calibri" w:hAnsi="Calibri"/>
+                <w:color w:val="5B6B85"/>
+                <w:sz w:val="15"/>
+                <w:szCs w:val="15"/>
+              </w:rPr>
+              <w:t xml:space="preserve">The borrower history the decision reads: EMIs, promises, calls answered</w:t>
+            </w:r>
+          </w:p>
+        </w:tc>
+      </w:tr>
+    </w:tbl>
+    <w:p>
+      <w:pPr>
+        <w:spacing w:after="55" w:before="70"/>
+      </w:pPr>
+      <w:r>
+        <w:rPr>
+          <w:rFonts w:ascii="Calibri" w:cs="Calibri" w:eastAsia="Calibri" w:hAnsi="Calibri"/>
+          <w:color w:val="11243A"/>
+          <w:sz w:val="17"/>
+          <w:szCs w:val="17"/>
+        </w:rPr>
+        <w:t xml:space="preserve">Two prompts do the work, and both return JSON rather than prose. The </w:t>
       </w:r>
       <w:r>
         <w:rPr>
@@ -806,7 +1407,7 @@
           <w:sz w:val="17"/>
           <w:szCs w:val="17"/>
         </w:rPr>
-        <w:t xml:space="preserve">agent.md</w:t>
+        <w:t xml:space="preserve">turn prompt</w:t>
       </w:r>
       <w:r>
         <w:rPr>
@@ -815,7 +1416,7 @@
           <w:sz w:val="17"/>
           <w:szCs w:val="17"/>
         </w:rPr>
-        <w:t xml:space="preserve"> for how Meera speaks, </w:t>
+        <w:t xml:space="preserve"> takes the call so far and returns what to say, what to speak aloud, which action to take (one payment link, raise a ticket, hand off) and whether to end the call. The </w:t>
       </w:r>
       <w:r>
         <w:rPr>
@@ -826,7 +1427,7 @@
           <w:sz w:val="17"/>
           <w:szCs w:val="17"/>
         </w:rPr>
-        <w:t xml:space="preserve">script.md</w:t>
+        <w:t xml:space="preserve">review prompt</w:t>
       </w:r>
       <w:r>
         <w:rPr>
@@ -835,141 +1436,7 @@
           <w:sz w:val="17"/>
           <w:szCs w:val="17"/>
         </w:rPr>
-        <w:t xml:space="preserve"> and </w:t>
-      </w:r>
-      <w:r>
-        <w:rPr>
-          <w:rFonts w:ascii="Calibri" w:cs="Calibri" w:eastAsia="Calibri" w:hAnsi="Calibri"/>
-          <w:b/>
-          <w:bCs/>
-          <w:color w:val="11243A"/>
-          <w:sz w:val="17"/>
-          <w:szCs w:val="17"/>
-        </w:rPr>
-        <w:t xml:space="preserve">policy.json</w:t>
-      </w:r>
-      <w:r>
-        <w:rPr>
-          <w:rFonts w:ascii="Calibri" w:cs="Calibri" w:eastAsia="Calibri" w:hAnsi="Calibri"/>
-          <w:color w:val="11243A"/>
-          <w:sz w:val="17"/>
-          <w:szCs w:val="17"/>
-        </w:rPr>
-        <w:t xml:space="preserve"> for what she may say, </w:t>
-      </w:r>
-      <w:r>
-        <w:rPr>
-          <w:rFonts w:ascii="Calibri" w:cs="Calibri" w:eastAsia="Calibri" w:hAnsi="Calibri"/>
-          <w:b/>
-          <w:bCs/>
-          <w:color w:val="11243A"/>
-          <w:sz w:val="17"/>
-          <w:szCs w:val="17"/>
-        </w:rPr>
-        <w:t xml:space="preserve">guardrails.json</w:t>
-      </w:r>
-      <w:r>
-        <w:rPr>
-          <w:rFonts w:ascii="Calibri" w:cs="Calibri" w:eastAsia="Calibri" w:hAnsi="Calibri"/>
-          <w:color w:val="11243A"/>
-          <w:sz w:val="17"/>
-          <w:szCs w:val="17"/>
-        </w:rPr>
-        <w:t xml:space="preserve"> and </w:t>
-      </w:r>
-      <w:r>
-        <w:rPr>
-          <w:rFonts w:ascii="Calibri" w:cs="Calibri" w:eastAsia="Calibri" w:hAnsi="Calibri"/>
-          <w:b/>
-          <w:bCs/>
-          <w:color w:val="11243A"/>
-          <w:sz w:val="17"/>
-          <w:szCs w:val="17"/>
-        </w:rPr>
-        <w:t xml:space="preserve">review-checks.json</w:t>
-      </w:r>
-      <w:r>
-        <w:rPr>
-          <w:rFonts w:ascii="Calibri" w:cs="Calibri" w:eastAsia="Calibri" w:hAnsi="Calibri"/>
-          <w:color w:val="11243A"/>
-          <w:sz w:val="17"/>
-          <w:szCs w:val="17"/>
-        </w:rPr>
-        <w:t xml:space="preserve"> for what counts as a breach, and </w:t>
-      </w:r>
-      <w:r>
-        <w:rPr>
-          <w:rFonts w:ascii="Calibri" w:cs="Calibri" w:eastAsia="Calibri" w:hAnsi="Calibri"/>
-          <w:b/>
-          <w:bCs/>
-          <w:color w:val="11243A"/>
-          <w:sz w:val="17"/>
-          <w:szCs w:val="17"/>
-        </w:rPr>
-        <w:t xml:space="preserve">decision-rules.json</w:t>
-      </w:r>
-      <w:r>
-        <w:rPr>
-          <w:rFonts w:ascii="Calibri" w:cs="Calibri" w:eastAsia="Calibri" w:hAnsi="Calibri"/>
-          <w:color w:val="11243A"/>
-          <w:sz w:val="17"/>
-          <w:szCs w:val="17"/>
-        </w:rPr>
-        <w:t xml:space="preserve"> for the thresholds that route a borrower. Changing her tone, or the number of bounces that sends a case to a person, is a text edit.</w:t>
-      </w:r>
-    </w:p>
-    <w:p>
-      <w:pPr>
-        <w:spacing w:after="55" w:line="225"/>
-      </w:pPr>
-      <w:r>
-        <w:rPr>
-          <w:rFonts w:ascii="Calibri" w:cs="Calibri" w:eastAsia="Calibri" w:hAnsi="Calibri"/>
-          <w:color w:val="11243A"/>
-          <w:sz w:val="17"/>
-          <w:szCs w:val="17"/>
-        </w:rPr>
-        <w:t xml:space="preserve">Two prompts do the work, and both return JSON rather than prose. The </w:t>
-      </w:r>
-      <w:r>
-        <w:rPr>
-          <w:rFonts w:ascii="Calibri" w:cs="Calibri" w:eastAsia="Calibri" w:hAnsi="Calibri"/>
-          <w:b/>
-          <w:bCs/>
-          <w:color w:val="11243A"/>
-          <w:sz w:val="17"/>
-          <w:szCs w:val="17"/>
-        </w:rPr>
-        <w:t xml:space="preserve">turn prompt</w:t>
-      </w:r>
-      <w:r>
-        <w:rPr>
-          <w:rFonts w:ascii="Calibri" w:cs="Calibri" w:eastAsia="Calibri" w:hAnsi="Calibri"/>
-          <w:color w:val="11243A"/>
-          <w:sz w:val="17"/>
-          <w:szCs w:val="17"/>
-        </w:rPr>
-        <w:t xml:space="preserve"> takes the call so far and returns what to say, what to speak aloud, which action to take (one payment link, raise a ticket, hand off) and whether to end the call. The </w:t>
-      </w:r>
-      <w:r>
-        <w:rPr>
-          <w:rFonts w:ascii="Calibri" w:cs="Calibri" w:eastAsia="Calibri" w:hAnsi="Calibri"/>
-          <w:b/>
-          <w:bCs/>
-          <w:color w:val="11243A"/>
-          <w:sz w:val="17"/>
-          <w:szCs w:val="17"/>
-        </w:rPr>
-        <w:t xml:space="preserve">review prompt</w:t>
-      </w:r>
-      <w:r>
-        <w:rPr>
-          <w:rFonts w:ascii="Calibri" w:cs="Calibri" w:eastAsia="Calibri" w:hAnsi="Calibri"/>
-          <w:color w:val="11243A"/>
-          <w:sz w:val="17"/>
-          <w:szCs w:val="17"/>
-        </w:rPr>
-        <w:t xml:space="preserve"> takes the finished transcript and returns the outcome, the reason, the root cause, the promise, the borrower's cooperation and a verdict on every rule. Structured output is what lets the rest of the system be ordinary code.</w:t>
+        <w:t xml:space="preserve"> takes the finished transcript and returns the outcome, the reason, the root cause, the promise, the borrower’s cooperation and a verdict on every rule. Structured output is what lets the rest of the system be ordinary, testable code — and it is why the model never picks the route.</w:t>
       </w:r>
     </w:p>
     <w:p>
@@ -980,7 +1447,7 @@
       <w:r>
         <w:drawing>
           <wp:inline distT="0" distB="0" distL="0" distR="0">
-            <wp:extent cx="4762500" cy="1438275"/>
+            <wp:extent cx="4762500" cy="2190750"/>
             <wp:effectExtent t="0" r="0" b="0" l="0"/>
             <wp:docPr id="1" name="" descr="" title=""/>
             <wp:cNvGraphicFramePr>
@@ -1005,7 +1472,7 @@
                   <pic:spPr bwMode="auto">
                     <a:xfrm>
                       <a:off x="0" y="0"/>
-                      <a:ext cx="4762500" cy="1438275"/>
+                      <a:ext cx="4762500" cy="2190750"/>
                     </a:xfrm>
                     <a:prstGeom prst="rect">
                       <a:avLst/>
@@ -1032,7 +1499,21 @@
           <w:sz w:val="15"/>
           <w:szCs w:val="15"/>
         </w:rPr>
-        <w:t xml:space="preserve">The agent: the call produces facts, the rules produce the route.</w:t>
+        <w:t xml:space="preserve">The system: speech and reasoning are separate services, and the rules, not the model, decide what happens next.</w:t>
+      </w:r>
+    </w:p>
+    <w:p>
+      <w:pPr>
+        <w:spacing w:after="55" w:line="225"/>
+      </w:pPr>
+      <w:r>
+        <w:rPr>
+          <w:rFonts w:ascii="Calibri" w:cs="Calibri" w:eastAsia="Calibri" w:hAnsi="Calibri"/>
+          <w:color w:val="11243A"/>
+          <w:sz w:val="16"/>
+          <w:szCs w:val="16"/>
+        </w:rPr>
+        <w:t xml:space="preserve">Reading it across: the borrower’s audio goes to the server, which sends it to Sarvam for transcription, builds the turn prompt from the content files, and calls the Claude API — which returns a structured turn rather than free text. Speech goes back out through Sarvam. Every event is written to Postgres as it happens, and the whole call log is pushed to a branch on GitHub. When the call ends, the review prompt and the checks written in code score the same call independently, and a flag from either counts. Only then does the decision engine combine those facts with the borrower’s history and pick a route.</w:t>
       </w:r>
     </w:p>
     <w:p>
@@ -1046,7 +1527,7 @@
           <w:sz w:val="17"/>
           <w:szCs w:val="17"/>
         </w:rPr>
-        <w:t xml:space="preserve">The build loop mattered as much as the prompts. Claude was connected to GitHub, and GitHub to Replit, so a change was live in minutes and I could watch it. More usefully, the call logs are pushed back to a branch in the same repository, so Claude could read what actually happened on a real call — what the borrower said, which rule tripped, where the agent stalled — and I could act on it immediately instead of listening to recordings and writing notes by hand.</w:t>
+        <w:t xml:space="preserve">The build loop mattered as much as the prompts. Claude was connected to GitHub, and GitHub to Replit, so a change was live in minutes and I could watch it. More usefully, those call logs are pushed back into the same repository, so Claude Code could read what actually happened on a real call — what the borrower said, which rule tripped, where the agent stalled — and I could act on it immediately instead of listening to recordings and writing notes by hand.</w:t>
       </w:r>
     </w:p>
     <w:p>

</xml_diff>

<commit_message>
Build log: three layers, updated diagram, rejected-output section, deliberate exclusions
Co-Authored-By: Claude Sonnet 5.5 <noreply@anthropic.com>
Claude-Session: https://claude.ai/code/session_01UkYraoXMEPqUCAeqnCcg3Y
</commit_message>
<xml_diff>
--- a/note/ai-build-log.docx
+++ b/note/ai-build-log.docx
@@ -46,9 +46,9 @@
           <w:sz w:val="15"/>
           <w:szCs w:val="15"/>
         </w:rPr>
-        <w:t xml:space="preserve">Ujjwal Goel  ·  55 commits, 5–13 October 2026  ·  ~5,000 lines of application code, 8,400 lines of rules and content, 37 tests  ·  </w:t>
-      </w:r>
-      <w:hyperlink w:history="1" r:id="rId_lutctjqrebuw5vi3fzhj">
+        <w:t xml:space="preserve">Ujjwal Goel  ·  68 commits, 5–13 October 2026 (45 by Claude Code, 13 by the Replit agent, 10 by me)  ·  ~11,800 lines of TypeScript, 8,400 lines of rules and content, 37 tests  ·  </w:t>
+      </w:r>
+      <w:hyperlink w:history="1" r:id="rIdjeispugsjv_noz1mos2yd">
         <w:r>
           <w:rPr>
             <w:rFonts w:ascii="Calibri" w:cs="Calibri" w:eastAsia="Calibri" w:hAnsi="Calibri"/>
@@ -809,7 +809,67 @@
           <w:sz w:val="17"/>
           <w:szCs w:val="17"/>
         </w:rPr>
-        <w:t xml:space="preserve">The agent is three things: a set of written instructions, two prompts that return JSON, and a rule engine the model is not allowed to overrule. The first part is all in the repository and can be read directly — these are the files that decide what the agent says and when it hands a borrower over.</w:t>
+        <w:t xml:space="preserve">The product is three layers: </w:t>
+      </w:r>
+      <w:r>
+        <w:rPr>
+          <w:rFonts w:ascii="Calibri" w:cs="Calibri" w:eastAsia="Calibri" w:hAnsi="Calibri"/>
+          <w:b/>
+          <w:bCs/>
+          <w:color w:val="11243A"/>
+          <w:sz w:val="17"/>
+          <w:szCs w:val="17"/>
+        </w:rPr>
+        <w:t xml:space="preserve">the calling bot</w:t>
+      </w:r>
+      <w:r>
+        <w:rPr>
+          <w:rFonts w:ascii="Calibri" w:cs="Calibri" w:eastAsia="Calibri" w:hAnsi="Calibri"/>
+          <w:color w:val="11243A"/>
+          <w:sz w:val="17"/>
+          <w:szCs w:val="17"/>
+        </w:rPr>
+        <w:t xml:space="preserve"> that makes the call, </w:t>
+      </w:r>
+      <w:r>
+        <w:rPr>
+          <w:rFonts w:ascii="Calibri" w:cs="Calibri" w:eastAsia="Calibri" w:hAnsi="Calibri"/>
+          <w:b/>
+          <w:bCs/>
+          <w:color w:val="11243A"/>
+          <w:sz w:val="17"/>
+          <w:szCs w:val="17"/>
+        </w:rPr>
+        <w:t xml:space="preserve">the call review bot</w:t>
+      </w:r>
+      <w:r>
+        <w:rPr>
+          <w:rFonts w:ascii="Calibri" w:cs="Calibri" w:eastAsia="Calibri" w:hAnsi="Calibri"/>
+          <w:color w:val="11243A"/>
+          <w:sz w:val="17"/>
+          <w:szCs w:val="17"/>
+        </w:rPr>
+        <w:t xml:space="preserve"> that reads it afterwards, and </w:t>
+      </w:r>
+      <w:r>
+        <w:rPr>
+          <w:rFonts w:ascii="Calibri" w:cs="Calibri" w:eastAsia="Calibri" w:hAnsi="Calibri"/>
+          <w:b/>
+          <w:bCs/>
+          <w:color w:val="11243A"/>
+          <w:sz w:val="17"/>
+          <w:szCs w:val="17"/>
+        </w:rPr>
+        <w:t xml:space="preserve">the bot that recommends an action plan</w:t>
+      </w:r>
+      <w:r>
+        <w:rPr>
+          <w:rFonts w:ascii="Calibri" w:cs="Calibri" w:eastAsia="Calibri" w:hAnsi="Calibri"/>
+          <w:color w:val="11243A"/>
+          <w:sz w:val="17"/>
+          <w:szCs w:val="17"/>
+        </w:rPr>
+        <w:t xml:space="preserve"> from what the calls revealed. Between them sit written instructions, two prompts that return JSON, and a rule engine the model is not allowed to overrule. The instructions are all in the repository and can be read directly — these are the files that decide what the agent says and when it hands a borrower over.</w:t>
       </w:r>
     </w:p>
     <w:tbl>
@@ -922,7 +982,7 @@
             <w:pPr>
               <w:spacing w:after="0" w:line="205"/>
             </w:pPr>
-            <w:hyperlink w:history="1" r:id="rIdcvwp9gk5oi70ehpyd8xhf">
+            <w:hyperlink w:history="1" r:id="rIdvcilskagbw3lybusjcepq">
               <w:r>
                 <w:rPr>
                   <w:rFonts w:ascii="Calibri" w:cs="Calibri" w:eastAsia="Calibri" w:hAnsi="Calibri"/>
@@ -991,7 +1051,7 @@
             <w:pPr>
               <w:spacing w:after="0" w:line="205"/>
             </w:pPr>
-            <w:hyperlink w:history="1" r:id="rIdn3zchk5erekpsubinwfzi">
+            <w:hyperlink w:history="1" r:id="rIdbdczxyil3dim_q38q4b3g">
               <w:r>
                 <w:rPr>
                   <w:rFonts w:ascii="Calibri" w:cs="Calibri" w:eastAsia="Calibri" w:hAnsi="Calibri"/>
@@ -1060,7 +1120,7 @@
             <w:pPr>
               <w:spacing w:after="0" w:line="205"/>
             </w:pPr>
-            <w:hyperlink w:history="1" r:id="rIdqopbsw8jshyjlm_74qh0v">
+            <w:hyperlink w:history="1" r:id="rId-x_ck8e5nh6wj8ow7emxh">
               <w:r>
                 <w:rPr>
                   <w:rFonts w:ascii="Calibri" w:cs="Calibri" w:eastAsia="Calibri" w:hAnsi="Calibri"/>
@@ -1129,7 +1189,7 @@
             <w:pPr>
               <w:spacing w:after="0" w:line="205"/>
             </w:pPr>
-            <w:hyperlink w:history="1" r:id="rIdvqihiggk3lsgr1rsdshyh">
+            <w:hyperlink w:history="1" r:id="rId6vvryazrs8hoifuubojs4">
               <w:r>
                 <w:rPr>
                   <w:rFonts w:ascii="Calibri" w:cs="Calibri" w:eastAsia="Calibri" w:hAnsi="Calibri"/>
@@ -1198,7 +1258,7 @@
             <w:pPr>
               <w:spacing w:after="0" w:line="205"/>
             </w:pPr>
-            <w:hyperlink w:history="1" r:id="rId2lxy4olar5ccslad_htjh">
+            <w:hyperlink w:history="1" r:id="rIdcswzpmvndaszs9lzc_dow">
               <w:r>
                 <w:rPr>
                   <w:rFonts w:ascii="Calibri" w:cs="Calibri" w:eastAsia="Calibri" w:hAnsi="Calibri"/>
@@ -1267,7 +1327,7 @@
             <w:pPr>
               <w:spacing w:after="0" w:line="205"/>
             </w:pPr>
-            <w:hyperlink w:history="1" r:id="rIdw7pmqiakoc1rld2vinghi">
+            <w:hyperlink w:history="1" r:id="rIdibjcn5ihftn_z1zcxylq1">
               <w:r>
                 <w:rPr>
                   <w:rFonts w:ascii="Calibri" w:cs="Calibri" w:eastAsia="Calibri" w:hAnsi="Calibri"/>
@@ -1336,7 +1396,7 @@
             <w:pPr>
               <w:spacing w:after="0" w:line="205"/>
             </w:pPr>
-            <w:hyperlink w:history="1" r:id="rIdwax7_md1jtv501w84ibzb">
+            <w:hyperlink w:history="1" r:id="rIdq7zslfnfazbctfmjtiayb">
               <w:r>
                 <w:rPr>
                   <w:rFonts w:ascii="Calibri" w:cs="Calibri" w:eastAsia="Calibri" w:hAnsi="Calibri"/>
@@ -1447,7 +1507,7 @@
       <w:r>
         <w:drawing>
           <wp:inline distT="0" distB="0" distL="0" distR="0">
-            <wp:extent cx="4762500" cy="2190750"/>
+            <wp:extent cx="4572000" cy="2105025"/>
             <wp:effectExtent t="0" r="0" b="0" l="0"/>
             <wp:docPr id="1" name="" descr="" title=""/>
             <wp:cNvGraphicFramePr>
@@ -1472,7 +1532,7 @@
                   <pic:spPr bwMode="auto">
                     <a:xfrm>
                       <a:off x="0" y="0"/>
-                      <a:ext cx="4762500" cy="2190750"/>
+                      <a:ext cx="4572000" cy="2105025"/>
                     </a:xfrm>
                     <a:prstGeom prst="rect">
                       <a:avLst/>
@@ -1499,7 +1559,7 @@
           <w:sz w:val="15"/>
           <w:szCs w:val="15"/>
         </w:rPr>
-        <w:t xml:space="preserve">The system: speech and reasoning are separate services, and the rules, not the model, decide what happens next.</w:t>
+        <w:t xml:space="preserve">The three layers: the call, the review of the call, and the plan. The rules, not the model, decide what happens next.</w:t>
       </w:r>
     </w:p>
     <w:p>
@@ -1513,7 +1573,7 @@
           <w:sz w:val="16"/>
           <w:szCs w:val="16"/>
         </w:rPr>
-        <w:t xml:space="preserve">Reading it across: the borrower’s audio goes to the server, which sends it to Sarvam for transcription, builds the turn prompt from the content files, and calls the Claude API — which returns a structured turn rather than free text. Speech goes back out through Sarvam. Every event is written to Postgres as it happens, and the whole call log is pushed to a branch on GitHub. When the call ends, the review prompt and the checks written in code score the same call independently, and a flag from either counts. Only then does the decision engine combine those facts with the borrower’s history and pick a route.</w:t>
+        <w:t xml:space="preserve">Reading it across: the borrower’s audio goes to the server, which sends it to Sarvam for transcription, builds the turn prompt from the content files, and calls the Claude API — which returns a structured turn rather than free text. Speech goes back out through Sarvam. Every event is written to Postgres as it happens, and the whole call log is pushed to a branch on GitHub. When the call ends, the review prompt and the checks written in code score the same call independently, and a flag from either counts. Only then does the decision engine combine those facts with the borrower’s history and pick a route. The third layer does not stop at one borrower: the Plan tab turns every route into a plan for the cycle — how many AI calls, person calls and reminders, how much money lands by day 1, 3 and 7, and whether the gap to target sits in the agent, in our callers or in where effort goes.</w:t>
       </w:r>
     </w:p>
     <w:p>
@@ -1538,7 +1598,7 @@
       <w:r>
         <w:drawing>
           <wp:inline distT="0" distB="0" distL="0" distR="0">
-            <wp:extent cx="4762500" cy="1333500"/>
+            <wp:extent cx="4572000" cy="1276350"/>
             <wp:effectExtent t="0" r="0" b="0" l="0"/>
             <wp:docPr id="1" name="" descr="" title=""/>
             <wp:cNvGraphicFramePr>
@@ -1563,7 +1623,7 @@
                   <pic:spPr bwMode="auto">
                     <a:xfrm>
                       <a:off x="0" y="0"/>
-                      <a:ext cx="4762500" cy="1333500"/>
+                      <a:ext cx="4572000" cy="1276350"/>
                     </a:xfrm>
                     <a:prstGeom prst="rect">
                       <a:avLst/>
@@ -1634,11 +1694,20 @@
           <w:rFonts w:ascii="Calibri" w:cs="Calibri" w:eastAsia="Calibri" w:hAnsi="Calibri"/>
           <w:b/>
           <w:bCs/>
-          <w:color w:val="1A4FD6"/>
-          <w:sz w:val="17"/>
-          <w:szCs w:val="17"/>
-        </w:rPr>
-        <w:t xml:space="preserve">[ To be completed ]</w:t>
+          <w:color w:val="11243A"/>
+          <w:sz w:val="17"/>
+          <w:szCs w:val="17"/>
+        </w:rPr>
+        <w:t xml:space="preserve">The suggestion: let the model judge everything. </w:t>
+      </w:r>
+      <w:r>
+        <w:rPr>
+          <w:rFonts w:ascii="Calibri" w:cs="Calibri" w:eastAsia="Calibri" w:hAnsi="Calibri"/>
+          <w:color w:val="11243A"/>
+          <w:sz w:val="17"/>
+          <w:szCs w:val="17"/>
+        </w:rPr>
+        <w:t xml:space="preserve">When I specified how the agent’s calls would be scored, the AI proposed the simplest design: give the model the transcript and let it judge every rule, hard and soft. It would have been less code and it read well in a demo.</w:t>
       </w:r>
     </w:p>
     <w:p>
@@ -1648,13 +1717,56 @@
       <w:r>
         <w:rPr>
           <w:rFonts w:ascii="Calibri" w:cs="Calibri" w:eastAsia="Calibri" w:hAnsi="Calibri"/>
-          <w:i/>
-          <w:iCs/>
+          <w:b/>
+          <w:bCs/>
+          <w:color w:val="11243A"/>
+          <w:sz w:val="17"/>
+          <w:szCs w:val="17"/>
+        </w:rPr>
+        <w:t xml:space="preserve">Why I rejected it. </w:t>
+      </w:r>
+      <w:r>
+        <w:rPr>
+          <w:rFonts w:ascii="Calibri" w:cs="Calibri" w:eastAsia="Calibri" w:hAnsi="Calibri"/>
+          <w:color w:val="11243A"/>
+          <w:sz w:val="17"/>
+          <w:szCs w:val="17"/>
+        </w:rPr>
+        <w:t xml:space="preserve">A lender cannot audit a verdict it cannot explain. If a model alone says a call broke a rule, nobody can show the regulator why, and nobody can tell whether the model or the agent was wrong. </w:t>
+      </w:r>
+      <w:r>
+        <w:rPr>
+          <w:rFonts w:ascii="Calibri" w:cs="Calibri" w:eastAsia="Calibri" w:hAnsi="Calibri"/>
+          <w:b/>
+          <w:bCs/>
+          <w:color w:val="11243A"/>
+          <w:sz w:val="17"/>
+          <w:szCs w:val="17"/>
+        </w:rPr>
+        <w:t xml:space="preserve">What I did instead. </w:t>
+      </w:r>
+      <w:r>
+        <w:rPr>
+          <w:rFonts w:ascii="Calibri" w:cs="Calibri" w:eastAsia="Calibri" w:hAnsi="Calibri"/>
+          <w:color w:val="11243A"/>
+          <w:sz w:val="17"/>
+          <w:szCs w:val="17"/>
+        </w:rPr>
+        <w:t xml:space="preserve">The hard rules (one payment link, no threat, nothing the lender has not approved) are checked in exact code. The judgement rules (did she listen first, did she handle the reason) are scored by the model, but each verdict must cite a quote from the call. A flag from either side counts as a breach. Every verdict can be traced to a line of code or a line of the transcript.</w:t>
+      </w:r>
+    </w:p>
+    <w:p>
+      <w:pPr>
+        <w:spacing w:after="55" w:line="225"/>
+      </w:pPr>
+      <w:r>
+        <w:rPr>
+          <w:rFonts w:ascii="Calibri" w:cs="Calibri" w:eastAsia="Calibri" w:hAnsi="Calibri"/>
           <w:color w:val="5B6B85"/>
           <w:sz w:val="15"/>
           <w:szCs w:val="15"/>
         </w:rPr>
-        <w:t xml:space="preserve">Candidates under consideration: the demo mode built on a separate interface, rejected because a demo on different screens proves nothing about the product; the fabricated statistic caught during review; the six-persona signal model cut down to one borrower with real history.</w:t>
+        <w:t xml:space="preserve">Also rejected: a demo mode first built on its own interface, because a demo on different screens proves nothing about the product. It now runs the real screens with canned data.</w:t>
       </w:r>
     </w:p>
     <w:p>
@@ -2010,7 +2122,7 @@
                 <w:sz w:val="15"/>
                 <w:szCs w:val="15"/>
               </w:rPr>
-              <w:t xml:space="preserve">Set the decision design: rules decide the route, the model only extracts facts. One persona with real history rather than six shallow ones.</w:t>
+              <w:t xml:space="preserve">Set the decision design: rules decide the route, the model only extracts facts. Hard rules in code, judgement rules scored by the model, so every verdict can be explained. One persona with real history rather than six shallow ones.</w:t>
             </w:r>
           </w:p>
         </w:tc>
@@ -2043,7 +2155,7 @@
                 <w:sz w:val="15"/>
                 <w:szCs w:val="15"/>
               </w:rPr>
-              <w:t xml:space="preserve">Built the decision engine, the confidence walk behind it, and 12 tests that pin the thresholds.</w:t>
+              <w:t xml:space="preserve">Built the decision engine and the tests that pin its thresholds, and implemented the hard and judgement rules as I specified them.</w:t>
             </w:r>
           </w:p>
         </w:tc>
@@ -2081,7 +2193,7 @@
                 <w:sz w:val="15"/>
                 <w:szCs w:val="15"/>
               </w:rPr>
-              <w:t xml:space="preserve">Specified the dashboard: which tabs exist, what each one answers, and which metrics matter enough to be shown large.</w:t>
+              <w:t xml:space="preserve">Specified the dashboard: which tabs exist, what each one answers, and who each is for. Decided the product must end in a plan, not a recommendation, and what the gap areas are: the agent, our callers, and where effort goes.</w:t>
             </w:r>
           </w:p>
         </w:tc>
@@ -2114,7 +2226,7 @@
                 <w:sz w:val="15"/>
                 <w:szCs w:val="15"/>
               </w:rPr>
-              <w:t xml:space="preserve">Built the screens, computed the metrics across a 100-call sample book, and rebuilt them when I changed the structure.</w:t>
+              <w:t xml:space="preserve">Built the screens and the Plan tab, computed the metrics across a 100-call sample book, and rebuilt them when I changed the structure.</w:t>
             </w:r>
           </w:p>
         </w:tc>
@@ -2220,7 +2332,21 @@
           <w:sz w:val="18"/>
           <w:szCs w:val="18"/>
         </w:rPr>
-        <w:t xml:space="preserve">Known limitations, risks and verification steps</w:t>
+        <w:t xml:space="preserve">What I deliberately left out</w:t>
+      </w:r>
+    </w:p>
+    <w:p>
+      <w:pPr>
+        <w:spacing w:after="55" w:line="225"/>
+      </w:pPr>
+      <w:r>
+        <w:rPr>
+          <w:rFonts w:ascii="Calibri" w:cs="Calibri" w:eastAsia="Calibri" w:hAnsi="Calibri"/>
+          <w:color w:val="11243A"/>
+          <w:sz w:val="16"/>
+          <w:szCs w:val="16"/>
+        </w:rPr>
+        <w:t xml:space="preserve">These were scoping decisions, not things the AI could not build. The reasons are in the product note.</w:t>
       </w:r>
     </w:p>
     <w:p>
@@ -2242,16 +2368,16 @@
           <w:sz w:val="17"/>
           <w:szCs w:val="17"/>
         </w:rPr>
-        <w:t xml:space="preserve">The numbers are synthetic. </w:t>
-      </w:r>
-      <w:r>
-        <w:rPr>
-          <w:rFonts w:ascii="Calibri" w:cs="Calibri" w:eastAsia="Calibri" w:hAnsi="Calibri"/>
-          <w:color w:val="11243A"/>
-          <w:sz w:val="17"/>
-          <w:szCs w:val="17"/>
-        </w:rPr>
-        <w:t xml:space="preserve">Every metric on the performance screens comes from a 100-call sample book, not from live borrowers. They show the measurement works, not that the agent works.</w:t>
+        <w:t xml:space="preserve">Pre-bounce awareness calling. </w:t>
+      </w:r>
+      <w:r>
+        <w:rPr>
+          <w:rFonts w:ascii="Calibri" w:cs="Calibri" w:eastAsia="Calibri" w:hAnsi="Calibri"/>
+          <w:color w:val="11243A"/>
+          <w:sz w:val="17"/>
+          <w:szCs w:val="17"/>
+        </w:rPr>
+        <w:t xml:space="preserve">Making a borrower aware in time can be done by an IVR call or a reminder. The talking, and the intent worth capturing, happens after the bounce, so that is where we started.</w:t>
       </w:r>
     </w:p>
     <w:p>
@@ -2273,16 +2399,34 @@
           <w:sz w:val="17"/>
           <w:szCs w:val="17"/>
         </w:rPr>
-        <w:t xml:space="preserve">The weights are uncalibrated. </w:t>
-      </w:r>
-      <w:r>
-        <w:rPr>
-          <w:rFonts w:ascii="Calibri" w:cs="Calibri" w:eastAsia="Calibri" w:hAnsi="Calibri"/>
-          <w:color w:val="11243A"/>
-          <w:sz w:val="17"/>
-          <w:szCs w:val="17"/>
-        </w:rPr>
-        <w:t xml:space="preserve">Nothing yet records whether a promise was kept, so the confidence walk behind the decision has never been checked against a real outcome. Until it is, the thresholds are reasoned, not proven.</w:t>
+        <w:t xml:space="preserve">One playbook for every lender. </w:t>
+      </w:r>
+      <w:r>
+        <w:rPr>
+          <w:rFonts w:ascii="Calibri" w:cs="Calibri" w:eastAsia="Calibri" w:hAnsi="Calibri"/>
+          <w:color w:val="11243A"/>
+          <w:sz w:val="17"/>
+          <w:szCs w:val="17"/>
+        </w:rPr>
+        <w:t xml:space="preserve">Each bank or NBFC sets up its own agent, so the demo journey is a sample. The product is the layer beneath any agent: better signals and the next step, not just another collections bot.</w:t>
+      </w:r>
+    </w:p>
+    <w:p>
+      <w:pPr>
+        <w:spacing w:after="50" w:before="150"/>
+      </w:pPr>
+      <w:r>
+        <w:rPr>
+          <w:rFonts w:ascii="Calibri" w:cs="Calibri" w:eastAsia="Calibri" w:hAnsi="Calibri"/>
+          <w:b/>
+          <w:bCs/>
+          <w:caps/>
+          <w:color w:val="1A4FD6"/>
+          <w:spacing w:val="20"/>
+          <w:sz w:val="18"/>
+          <w:szCs w:val="18"/>
+        </w:rPr>
+        <w:t xml:space="preserve">Known limitations, risks and verification steps</w:t>
       </w:r>
     </w:p>
     <w:p>
@@ -2304,16 +2448,16 @@
           <w:sz w:val="17"/>
           <w:szCs w:val="17"/>
         </w:rPr>
-        <w:t xml:space="preserve">The AI reviewer is untuned. </w:t>
-      </w:r>
-      <w:r>
-        <w:rPr>
-          <w:rFonts w:ascii="Calibri" w:cs="Calibri" w:eastAsia="Calibri" w:hAnsi="Calibri"/>
-          <w:color w:val="11243A"/>
-          <w:sz w:val="17"/>
-          <w:szCs w:val="17"/>
-        </w:rPr>
-        <w:t xml:space="preserve">The 29.7% hard-rule breach rate on sample calls is partly the reviewer being strict and partly the agent being wrong, and I cannot yet separate the two.</w:t>
+        <w:t xml:space="preserve">The numbers are synthetic. </w:t>
+      </w:r>
+      <w:r>
+        <w:rPr>
+          <w:rFonts w:ascii="Calibri" w:cs="Calibri" w:eastAsia="Calibri" w:hAnsi="Calibri"/>
+          <w:color w:val="11243A"/>
+          <w:sz w:val="17"/>
+          <w:szCs w:val="17"/>
+        </w:rPr>
+        <w:t xml:space="preserve">Every metric on the performance screens comes from a 100-call sample book, not from live borrowers. They show the measurement works, not that the agent works.</w:t>
       </w:r>
     </w:p>
     <w:p>
@@ -2335,16 +2479,16 @@
           <w:sz w:val="17"/>
           <w:szCs w:val="17"/>
         </w:rPr>
-        <w:t xml:space="preserve">How it was verified. </w:t>
-      </w:r>
-      <w:r>
-        <w:rPr>
-          <w:rFonts w:ascii="Calibri" w:cs="Calibri" w:eastAsia="Calibri" w:hAnsi="Calibri"/>
-          <w:color w:val="11243A"/>
-          <w:sz w:val="17"/>
-          <w:szCs w:val="17"/>
-        </w:rPr>
-        <w:t xml:space="preserve">Rules are checked twice, by exact code and by the model, and a flag from either counts. 37 automated tests pin the decision thresholds and the metric arithmetic. Screens were checked by screenshot, not by assertion. Every figure in the product note carries a source and a confidence level, and the figures I calculated myself are labelled as mine.</w:t>
+        <w:t xml:space="preserve">The weights are uncalibrated. </w:t>
+      </w:r>
+      <w:r>
+        <w:rPr>
+          <w:rFonts w:ascii="Calibri" w:cs="Calibri" w:eastAsia="Calibri" w:hAnsi="Calibri"/>
+          <w:color w:val="11243A"/>
+          <w:sz w:val="17"/>
+          <w:szCs w:val="17"/>
+        </w:rPr>
+        <w:t xml:space="preserve">Nothing yet records whether a promise was kept, so the confidence walk behind the decision has never been checked against a real outcome. Until it is, the thresholds are reasoned, not proven.</w:t>
       </w:r>
     </w:p>
     <w:p>
@@ -2366,16 +2510,78 @@
           <w:sz w:val="17"/>
           <w:szCs w:val="17"/>
         </w:rPr>
-        <w:t xml:space="preserve">Where I had to verify the AI directly. </w:t>
-      </w:r>
-      <w:r>
-        <w:rPr>
-          <w:rFonts w:ascii="Calibri" w:cs="Calibri" w:eastAsia="Calibri" w:hAnsi="Calibri"/>
-          <w:color w:val="11243A"/>
-          <w:sz w:val="17"/>
-          <w:szCs w:val="17"/>
-        </w:rPr>
-        <w:t xml:space="preserve">It produced a statistic that was not in the data. It is the reason every number in these documents was traced back to either a source or a computation before it shipped.</w:t>
+        <w:t xml:space="preserve">The plan is shown, not executed. </w:t>
+      </w:r>
+      <w:r>
+        <w:rPr>
+          <w:rFonts w:ascii="Calibri" w:cs="Calibri" w:eastAsia="Calibri" w:hAnsi="Calibri"/>
+          <w:color w:val="11243A"/>
+          <w:sz w:val="17"/>
+          <w:szCs w:val="17"/>
+        </w:rPr>
+        <w:t xml:space="preserve">The Plan tab says what to do this cycle, but nothing yet dials, hands a case over or sends a reminder, and the sample holds no results for person calls, so none are assumed.</w:t>
+      </w:r>
+    </w:p>
+    <w:p>
+      <w:pPr>
+        <w:pStyle w:val="ListParagraph"/>
+        <w:numPr>
+          <w:ilvl w:val="0"/>
+          <w:numId w:val="1"/>
+        </w:numPr>
+        <w:spacing w:after="32" w:line="225"/>
+        <w:ind w:left="190" w:hanging="150"/>
+      </w:pPr>
+      <w:r>
+        <w:rPr>
+          <w:rFonts w:ascii="Calibri" w:cs="Calibri" w:eastAsia="Calibri" w:hAnsi="Calibri"/>
+          <w:b/>
+          <w:bCs/>
+          <w:color w:val="11243A"/>
+          <w:sz w:val="17"/>
+          <w:szCs w:val="17"/>
+        </w:rPr>
+        <w:t xml:space="preserve">The AI reviewer is untuned. </w:t>
+      </w:r>
+      <w:r>
+        <w:rPr>
+          <w:rFonts w:ascii="Calibri" w:cs="Calibri" w:eastAsia="Calibri" w:hAnsi="Calibri"/>
+          <w:color w:val="11243A"/>
+          <w:sz w:val="17"/>
+          <w:szCs w:val="17"/>
+        </w:rPr>
+        <w:t xml:space="preserve">The 29.7% hard-rule breach rate on sample calls is partly the reviewer being strict and partly the agent being wrong, and I cannot yet separate the two.</w:t>
+      </w:r>
+    </w:p>
+    <w:p>
+      <w:pPr>
+        <w:pStyle w:val="ListParagraph"/>
+        <w:numPr>
+          <w:ilvl w:val="0"/>
+          <w:numId w:val="1"/>
+        </w:numPr>
+        <w:spacing w:after="32" w:line="225"/>
+        <w:ind w:left="190" w:hanging="150"/>
+      </w:pPr>
+      <w:r>
+        <w:rPr>
+          <w:rFonts w:ascii="Calibri" w:cs="Calibri" w:eastAsia="Calibri" w:hAnsi="Calibri"/>
+          <w:b/>
+          <w:bCs/>
+          <w:color w:val="11243A"/>
+          <w:sz w:val="17"/>
+          <w:szCs w:val="17"/>
+        </w:rPr>
+        <w:t xml:space="preserve">How it was verified. </w:t>
+      </w:r>
+      <w:r>
+        <w:rPr>
+          <w:rFonts w:ascii="Calibri" w:cs="Calibri" w:eastAsia="Calibri" w:hAnsi="Calibri"/>
+          <w:color w:val="11243A"/>
+          <w:sz w:val="17"/>
+          <w:szCs w:val="17"/>
+        </w:rPr>
+        <w:t xml:space="preserve">Rules are checked twice, by exact code and by the model, and a flag from either counts. 37 automated tests pin the decision thresholds and the metric arithmetic. Screens were checked by screenshot, not by assertion. Every figure in the product note carries a source, or is labelled as my own calculation, because the AI once wrote a statistic that was not in the data.</w:t>
       </w:r>
     </w:p>
     <w:sectPr>

</xml_diff>

<commit_message>
Note: two more Why Razorpay points. Build log: How AI helped me 10x
Co-Authored-By: Claude Sonnet 5.5 <noreply@anthropic.com>
Claude-Session: https://claude.ai/code/session_01UkYraoXMEPqUCAeqnCcg3Y
</commit_message>
<xml_diff>
--- a/note/ai-build-log.docx
+++ b/note/ai-build-log.docx
@@ -46,9 +46,9 @@
           <w:sz w:val="15"/>
           <w:szCs w:val="15"/>
         </w:rPr>
-        <w:t xml:space="preserve">Ujjwal Goel  ·  68 commits, 5–13 October 2026 (45 by Claude Code, 13 by the Replit agent, 10 by me)  ·  ~11,800 lines of TypeScript, 8,400 lines of rules and content, 37 tests  ·  </w:t>
-      </w:r>
-      <w:hyperlink w:history="1" r:id="rIdjeispugsjv_noz1mos2yd">
+        <w:t xml:space="preserve">Ujjwal Goel  ·  68 commits, 5–13 Oct 2026 (45 Claude Code, 13 Replit agent, 10 me)  ·  ~11,800 lines of TypeScript, 8,400 of rules and content, 37 tests  ·  </w:t>
+      </w:r>
+      <w:hyperlink w:history="1" r:id="rIdvg6re7vn3nuxx7vwzg4_d">
         <w:r>
           <w:rPr>
             <w:rFonts w:ascii="Calibri" w:cs="Calibri" w:eastAsia="Calibri" w:hAnsi="Calibri"/>
@@ -375,7 +375,7 @@
                 <w:sz w:val="15"/>
                 <w:szCs w:val="15"/>
               </w:rPr>
-              <w:t xml:space="preserve">Runs inside the product: drives each turn of the live call, then reviews the finished call and scores it against the rules (LLM_MODEL, LLM_REVIEW_MODEL)</w:t>
+              <w:t xml:space="preserve">Runs inside the product: drives each turn of the call, then reviews it and scores it against the rules</w:t>
             </w:r>
           </w:p>
         </w:tc>
@@ -583,7 +583,7 @@
                 <w:sz w:val="15"/>
                 <w:szCs w:val="15"/>
               </w:rPr>
-              <w:t xml:space="preserve">Hosting and deployment, with its agent working the same repository in parallel</w:t>
+              <w:t xml:space="preserve">Hosting and deployment; its agent worked the same repository</w:t>
             </w:r>
           </w:p>
         </w:tc>
@@ -778,6 +778,117 @@
           <w:szCs w:val="16"/>
         </w:rPr>
         <w:t xml:space="preserve"> it. The agent a borrower speaks to is a Claude model with Sarvam speech on either side; the thing that wrote it is Claude Code.</w:t>
+      </w:r>
+    </w:p>
+    <w:p>
+      <w:pPr>
+        <w:spacing w:after="50" w:before="150"/>
+      </w:pPr>
+      <w:r>
+        <w:rPr>
+          <w:rFonts w:ascii="Calibri" w:cs="Calibri" w:eastAsia="Calibri" w:hAnsi="Calibri"/>
+          <w:b/>
+          <w:bCs/>
+          <w:caps/>
+          <w:color w:val="1A4FD6"/>
+          <w:spacing w:val="20"/>
+          <w:sz w:val="18"/>
+          <w:szCs w:val="18"/>
+        </w:rPr>
+        <w:t xml:space="preserve">How AI helped me 10x</w:t>
+      </w:r>
+    </w:p>
+    <w:p>
+      <w:pPr>
+        <w:pStyle w:val="ListParagraph"/>
+        <w:numPr>
+          <w:ilvl w:val="0"/>
+          <w:numId w:val="1"/>
+        </w:numPr>
+        <w:spacing w:after="32" w:line="225"/>
+        <w:ind w:left="190" w:hanging="150"/>
+      </w:pPr>
+      <w:r>
+        <w:rPr>
+          <w:rFonts w:ascii="Calibri" w:cs="Calibri" w:eastAsia="Calibri" w:hAnsi="Calibri"/>
+          <w:b/>
+          <w:bCs/>
+          <w:color w:val="11243A"/>
+          <w:sz w:val="17"/>
+          <w:szCs w:val="17"/>
+        </w:rPr>
+        <w:t xml:space="preserve">Breadth one person could not cover. </w:t>
+      </w:r>
+      <w:r>
+        <w:rPr>
+          <w:rFonts w:ascii="Calibri" w:cs="Calibri" w:eastAsia="Calibri" w:hAnsi="Calibri"/>
+          <w:color w:val="11243A"/>
+          <w:sz w:val="17"/>
+          <w:szCs w:val="17"/>
+        </w:rPr>
+        <w:t xml:space="preserve">A Hindi voice agent, a call review step, a decision engine, a six-tab dashboard and a planning tab, built in nine days: 68 commits, about 11,800 lines of code and 37 tests.</w:t>
+      </w:r>
+    </w:p>
+    <w:p>
+      <w:pPr>
+        <w:pStyle w:val="ListParagraph"/>
+        <w:numPr>
+          <w:ilvl w:val="0"/>
+          <w:numId w:val="1"/>
+        </w:numPr>
+        <w:spacing w:after="32" w:line="225"/>
+        <w:ind w:left="190" w:hanging="150"/>
+      </w:pPr>
+      <w:r>
+        <w:rPr>
+          <w:rFonts w:ascii="Calibri" w:cs="Calibri" w:eastAsia="Calibri" w:hAnsi="Calibri"/>
+          <w:b/>
+          <w:bCs/>
+          <w:color w:val="11243A"/>
+          <w:sz w:val="17"/>
+          <w:szCs w:val="17"/>
+        </w:rPr>
+        <w:t xml:space="preserve">Research in hours. </w:t>
+      </w:r>
+      <w:r>
+        <w:rPr>
+          <w:rFonts w:ascii="Calibri" w:cs="Calibri" w:eastAsia="Calibri" w:hAnsi="Calibri"/>
+          <w:color w:val="11243A"/>
+          <w:sz w:val="17"/>
+          <w:szCs w:val="17"/>
+        </w:rPr>
+        <w:t xml:space="preserve">AI scored the candidate problems against my criteria and researched the market size, the bounce data and the RBI recovery directions.</w:t>
+      </w:r>
+    </w:p>
+    <w:p>
+      <w:pPr>
+        <w:pStyle w:val="ListParagraph"/>
+        <w:numPr>
+          <w:ilvl w:val="0"/>
+          <w:numId w:val="1"/>
+        </w:numPr>
+        <w:spacing w:after="32" w:line="225"/>
+        <w:ind w:left="190" w:hanging="150"/>
+      </w:pPr>
+      <w:r>
+        <w:rPr>
+          <w:rFonts w:ascii="Calibri" w:cs="Calibri" w:eastAsia="Calibri" w:hAnsi="Calibri"/>
+          <w:b/>
+          <w:bCs/>
+          <w:color w:val="11243A"/>
+          <w:sz w:val="17"/>
+          <w:szCs w:val="17"/>
+        </w:rPr>
+        <w:t xml:space="preserve">A feedback loop that closed in minutes. </w:t>
+      </w:r>
+      <w:r>
+        <w:rPr>
+          <w:rFonts w:ascii="Calibri" w:cs="Calibri" w:eastAsia="Calibri" w:hAnsi="Calibri"/>
+          <w:color w:val="11243A"/>
+          <w:sz w:val="17"/>
+          <w:szCs w:val="17"/>
+        </w:rPr>
+        <w:t xml:space="preserve">Real call logs go to GitHub, Claude Code reads what happened, I edit a script line or a threshold, and the live app has it the same evening.</w:t>
       </w:r>
     </w:p>
     <w:p>
@@ -982,7 +1093,7 @@
             <w:pPr>
               <w:spacing w:after="0" w:line="205"/>
             </w:pPr>
-            <w:hyperlink w:history="1" r:id="rIdvcilskagbw3lybusjcepq">
+            <w:hyperlink w:history="1" r:id="rId-hdimc5te2_tw6dvdvoh-">
               <w:r>
                 <w:rPr>
                   <w:rFonts w:ascii="Calibri" w:cs="Calibri" w:eastAsia="Calibri" w:hAnsi="Calibri"/>
@@ -1051,7 +1162,7 @@
             <w:pPr>
               <w:spacing w:after="0" w:line="205"/>
             </w:pPr>
-            <w:hyperlink w:history="1" r:id="rIdbdczxyil3dim_q38q4b3g">
+            <w:hyperlink w:history="1" r:id="rIduwob4gi5di0sovk1sed-q">
               <w:r>
                 <w:rPr>
                   <w:rFonts w:ascii="Calibri" w:cs="Calibri" w:eastAsia="Calibri" w:hAnsi="Calibri"/>
@@ -1120,7 +1231,7 @@
             <w:pPr>
               <w:spacing w:after="0" w:line="205"/>
             </w:pPr>
-            <w:hyperlink w:history="1" r:id="rId-x_ck8e5nh6wj8ow7emxh">
+            <w:hyperlink w:history="1" r:id="rIdmpju_dho7baumyuocdcia">
               <w:r>
                 <w:rPr>
                   <w:rFonts w:ascii="Calibri" w:cs="Calibri" w:eastAsia="Calibri" w:hAnsi="Calibri"/>
@@ -1189,7 +1300,7 @@
             <w:pPr>
               <w:spacing w:after="0" w:line="205"/>
             </w:pPr>
-            <w:hyperlink w:history="1" r:id="rId6vvryazrs8hoifuubojs4">
+            <w:hyperlink w:history="1" r:id="rIdc4riasaeojkuihkj4xwmo">
               <w:r>
                 <w:rPr>
                   <w:rFonts w:ascii="Calibri" w:cs="Calibri" w:eastAsia="Calibri" w:hAnsi="Calibri"/>
@@ -1258,7 +1369,7 @@
             <w:pPr>
               <w:spacing w:after="0" w:line="205"/>
             </w:pPr>
-            <w:hyperlink w:history="1" r:id="rIdcswzpmvndaszs9lzc_dow">
+            <w:hyperlink w:history="1" r:id="rIdnbs2tug3cfrtkmtw520x9">
               <w:r>
                 <w:rPr>
                   <w:rFonts w:ascii="Calibri" w:cs="Calibri" w:eastAsia="Calibri" w:hAnsi="Calibri"/>
@@ -1327,7 +1438,7 @@
             <w:pPr>
               <w:spacing w:after="0" w:line="205"/>
             </w:pPr>
-            <w:hyperlink w:history="1" r:id="rIdibjcn5ihftn_z1zcxylq1">
+            <w:hyperlink w:history="1" r:id="rIdo6eq2kpl2qp-05i8l3odw">
               <w:r>
                 <w:rPr>
                   <w:rFonts w:ascii="Calibri" w:cs="Calibri" w:eastAsia="Calibri" w:hAnsi="Calibri"/>
@@ -1396,7 +1507,7 @@
             <w:pPr>
               <w:spacing w:after="0" w:line="205"/>
             </w:pPr>
-            <w:hyperlink w:history="1" r:id="rIdq7zslfnfazbctfmjtiayb">
+            <w:hyperlink w:history="1" r:id="rIdbkpsq090zziksxkkrje2f">
               <w:r>
                 <w:rPr>
                   <w:rFonts w:ascii="Calibri" w:cs="Calibri" w:eastAsia="Calibri" w:hAnsi="Calibri"/>
@@ -1507,7 +1618,7 @@
       <w:r>
         <w:drawing>
           <wp:inline distT="0" distB="0" distL="0" distR="0">
-            <wp:extent cx="4572000" cy="2105025"/>
+            <wp:extent cx="4381500" cy="2019300"/>
             <wp:effectExtent t="0" r="0" b="0" l="0"/>
             <wp:docPr id="1" name="" descr="" title=""/>
             <wp:cNvGraphicFramePr>
@@ -1532,7 +1643,7 @@
                   <pic:spPr bwMode="auto">
                     <a:xfrm>
                       <a:off x="0" y="0"/>
-                      <a:ext cx="4572000" cy="2105025"/>
+                      <a:ext cx="4381500" cy="2019300"/>
                     </a:xfrm>
                     <a:prstGeom prst="rect">
                       <a:avLst/>
@@ -1573,7 +1684,7 @@
           <w:sz w:val="16"/>
           <w:szCs w:val="16"/>
         </w:rPr>
-        <w:t xml:space="preserve">Reading it across: the borrower’s audio goes to the server, which sends it to Sarvam for transcription, builds the turn prompt from the content files, and calls the Claude API — which returns a structured turn rather than free text. Speech goes back out through Sarvam. Every event is written to Postgres as it happens, and the whole call log is pushed to a branch on GitHub. When the call ends, the review prompt and the checks written in code score the same call independently, and a flag from either counts. Only then does the decision engine combine those facts with the borrower’s history and pick a route. The third layer does not stop at one borrower: the Plan tab turns every route into a plan for the cycle — how many AI calls, person calls and reminders, how much money lands by day 1, 3 and 7, and whether the gap to target sits in the agent, in our callers or in where effort goes.</w:t>
+        <w:t xml:space="preserve">Reading it across: the borrower’s audio goes to the server, which sends it to Sarvam for transcription, builds the turn prompt from the content files, and calls the Claude API for a structured turn; speech goes back out through Sarvam. Every event is written to Postgres and the call log is pushed to GitHub. When the call ends, the review prompt and the checks written in code score the same call independently, and a flag from either counts. Only then does the decision engine combine those facts with the borrower’s history and pick a route. The third layer does not stop at one borrower: the Plan tab turns every route into a plan for the cycle — how many AI calls, person calls and reminders, how much money lands by day 1, 3 and 7, and whether the gap to target sits in the agent, in our callers or in where effort goes.</w:t>
       </w:r>
     </w:p>
     <w:p>
@@ -1587,7 +1698,7 @@
           <w:sz w:val="17"/>
           <w:szCs w:val="17"/>
         </w:rPr>
-        <w:t xml:space="preserve">The build loop mattered as much as the prompts. Claude was connected to GitHub, and GitHub to Replit, so a change was live in minutes and I could watch it. More usefully, those call logs are pushed back into the same repository, so Claude Code could read what actually happened on a real call — what the borrower said, which rule tripped, where the agent stalled — and I could act on it immediately instead of listening to recordings and writing notes by hand.</w:t>
+        <w:t xml:space="preserve">The build loop mattered as much as the prompts. Claude was connected to GitHub, and GitHub to Replit, so a change was live in minutes. Call logs are pushed back into the same repository, so Claude Code could read what actually happened on a real call — what the borrower said, which rule tripped, where the agent stalled — instead of me listening to recordings and writing notes. Every change passed typecheck, build, 37 tests and a screenshot of the real screen before it was committed.</w:t>
       </w:r>
     </w:p>
     <w:p>
@@ -1598,7 +1709,7 @@
       <w:r>
         <w:drawing>
           <wp:inline distT="0" distB="0" distL="0" distR="0">
-            <wp:extent cx="4572000" cy="1276350"/>
+            <wp:extent cx="4381500" cy="1228725"/>
             <wp:effectExtent t="0" r="0" b="0" l="0"/>
             <wp:docPr id="1" name="" descr="" title=""/>
             <wp:cNvGraphicFramePr>
@@ -1623,7 +1734,7 @@
                   <pic:spPr bwMode="auto">
                     <a:xfrm>
                       <a:off x="0" y="0"/>
-                      <a:ext cx="4572000" cy="1276350"/>
+                      <a:ext cx="4381500" cy="1228725"/>
                     </a:xfrm>
                     <a:prstGeom prst="rect">
                       <a:avLst/>
@@ -1655,20 +1766,6 @@
     </w:p>
     <w:p>
       <w:pPr>
-        <w:spacing w:after="55" w:line="225"/>
-      </w:pPr>
-      <w:r>
-        <w:rPr>
-          <w:rFonts w:ascii="Calibri" w:cs="Calibri" w:eastAsia="Calibri" w:hAnsi="Calibri"/>
-          <w:color w:val="11243A"/>
-          <w:sz w:val="16"/>
-          <w:szCs w:val="16"/>
-        </w:rPr>
-        <w:t xml:space="preserve">Every change ran the same gate before it was committed: typecheck, build, 37 tests, then a screenshot of the actual screen that the AI had to look at before claiming it worked. The decision engine deliberately has no runtime imports so its tests run standalone.</w:t>
-      </w:r>
-    </w:p>
-    <w:p>
-      <w:pPr>
         <w:spacing w:after="50" w:before="150"/>
       </w:pPr>
       <w:r>
@@ -1766,7 +1863,7 @@
           <w:sz w:val="15"/>
           <w:szCs w:val="15"/>
         </w:rPr>
-        <w:t xml:space="preserve">Also rejected: a demo mode first built on its own interface, because a demo on different screens proves nothing about the product. It now runs the real screens with canned data.</w:t>
+        <w:t xml:space="preserve">Also rejected: a demo mode on its own interface. It now runs the real screens with canned data.</w:t>
       </w:r>
     </w:p>
     <w:p>
@@ -2314,7 +2411,7 @@
           <w:sz w:val="16"/>
           <w:szCs w:val="16"/>
         </w:rPr>
-        <w:t xml:space="preserve">The honest summary: the AI was a computational assistant. It did the heavy lifting — code, computation, research, sample data — and it sharpened what I already knew by arguing with it. It did not choose the problem, define the collections process, write the guardrails or decide what the dashboard should answer. Those came from my own time in this domain and from the three interviews.</w:t>
+        <w:t xml:space="preserve">The honest summary: the AI was a computational assistant. It did the heavy lifting — code, computation, research, sample data — and sharpened what I knew by arguing with it. The problem, the collections process, the guardrails and what each screen answers came from my own time in this domain and the three interviews.</w:t>
       </w:r>
     </w:p>
     <w:p>
@@ -2550,7 +2647,7 @@
           <w:sz w:val="17"/>
           <w:szCs w:val="17"/>
         </w:rPr>
-        <w:t xml:space="preserve">The 29.7% hard-rule breach rate on sample calls is partly the reviewer being strict and partly the agent being wrong, and I cannot yet separate the two.</w:t>
+        <w:t xml:space="preserve">The 29.7% hard-rule breach rate on sample calls is partly a strict reviewer and partly the agent being wrong; I cannot yet separate the two.</w:t>
       </w:r>
     </w:p>
     <w:p>
@@ -2581,12 +2678,12 @@
           <w:sz w:val="17"/>
           <w:szCs w:val="17"/>
         </w:rPr>
-        <w:t xml:space="preserve">Rules are checked twice, by exact code and by the model, and a flag from either counts. 37 automated tests pin the decision thresholds and the metric arithmetic. Screens were checked by screenshot, not by assertion. Every figure in the product note carries a source, or is labelled as my own calculation, because the AI once wrote a statistic that was not in the data.</w:t>
+        <w:t xml:space="preserve">Rules are checked twice, by exact code and by the model, and a flag from either counts. 37 tests pin the thresholds and the metric arithmetic, and screens were checked by screenshot. Every figure in the note has a source or is labelled my own calculation, because the AI once wrote a statistic that was not in the data.</w:t>
       </w:r>
     </w:p>
     <w:sectPr>
       <w:pgSz w:w="11906" w:h="16838" w:orient="portrait"/>
-      <w:pgMar w:top="720" w:right="863" w:bottom="648" w:left="863" w:header="708" w:footer="708" w:gutter="0"/>
+      <w:pgMar w:top="576" w:right="863" w:bottom="504" w:left="863" w:header="708" w:footer="708" w:gutter="0"/>
       <w:pgNumType/>
       <w:docGrid w:linePitch="360"/>
     </w:sectPr>

</xml_diff>